<commit_message>
Restore and rebrand ten public free downloads; targeted dry run [skip deploy]
</commit_message>
<xml_diff>
--- a/products-storage/00-free-avans-do-podpisi/01-proverochnyy-list-usloviy-avansa.docx
+++ b/products-storage/00-free-avans-do-podpisi/01-proverochnyy-list-usloviy-avansa.docx
@@ -868,89 +868,12 @@
         <w:pStyle w:val="Heading1"/>
       </w:pPr>
       <w:r>
-        <w:t>Чего этот материал не обещает</w:t>
+        <w:t>Когда требуется разбор ситуации</w:t>
       </w:r>
     </w:p>
     <w:p>
       <w:r>
-        <w:t>Обещания, что условия изменят, в этом материале нет. Размер аванса, порядок его погашения и вид обеспечения — предмет переговоров, а не права: сильная сторона в них вторая, и часть договоров подписывается как есть. Материал влияет на другое — вы входите в работу, зная цену условий заранее, а не узнаёте её из первого платежа. Решение «подписывать или нет» остаётся вашим, и оно тем осмысленнее, чем раньше посчитано.</w:t>
-      </w:r>
-    </w:p>
-    <w:p>
-      <w:pPr>
-        <w:pStyle w:val="Heading1"/>
-      </w:pPr>
-      <w:r>
-        <w:t>Граница: где заканчивается этот материал и начинается юрист</w:t>
-      </w:r>
-    </w:p>
-    <w:p>
-      <w:r>
-        <w:t>Материал не заменяет юриста и юристом не вычитан. Он про то, что прочитать и посчитать своими силами до подписи, а не про оценку вашего договора. Юрист нужен, когда вторая сторона предъявила требование о возврате аванса, когда предъявлено требование по банковской гарантии или поручительству, когда договор расторгается любой из сторон, когда вам предлагают подписать документ, меняющий природу долга (зачёт, уступку, отступное, новацию, соглашение о переводе долга), и когда идёт спор об объёме и стоимости выполненного.</w:t>
-      </w:r>
-    </w:p>
-    <w:p>
-      <w:pPr>
-        <w:pStyle w:val="Heading1"/>
-      </w:pPr>
-      <w:r>
-        <w:t>⚠️ Что этот материал НЕ закрывает</w:t>
-      </w:r>
-    </w:p>
-    <w:p>
-      <w:pPr>
-        <w:pStyle w:val="ListBullet"/>
-      </w:pPr>
-      <w:r>
-        <w:t>Расчёт кассового профиля по месяцам и точку максимального минуса</w:t>
-      </w:r>
-    </w:p>
-    <w:p>
-      <w:pPr>
-        <w:pStyle w:val="ListBullet"/>
-      </w:pPr>
-      <w:r>
-        <w:t>Сравнение двух сценариев условий рядом, в деньгах</w:t>
-      </w:r>
-    </w:p>
-    <w:p>
-      <w:pPr>
-        <w:pStyle w:val="ListBullet"/>
-      </w:pPr>
-      <w:r>
-        <w:t>Порядок переговоров: что просить первым и чем уступать</w:t>
-      </w:r>
-    </w:p>
-    <w:p>
-      <w:pPr>
-        <w:pStyle w:val="ListBullet"/>
-      </w:pPr>
-      <w:r>
-        <w:t>Готовые формулировки для протокола разногласий по авансовым пунктам</w:t>
-      </w:r>
-    </w:p>
-    <w:p>
-      <w:pPr>
-        <w:pStyle w:val="ListBullet"/>
-      </w:pPr>
-      <w:r>
-        <w:t>Допсоглашение о порядке погашения аванса, когда договор уже подписан</w:t>
-      </w:r>
-    </w:p>
-    <w:p>
-      <w:pPr>
-        <w:pStyle w:val="ListBullet"/>
-      </w:pPr>
-      <w:r>
-        <w:t>Расчёт отработанной части аванса и сальдо расчётов</w:t>
-      </w:r>
-    </w:p>
-    <w:p>
-      <w:pPr>
-        <w:pStyle w:val="ListBullet"/>
-      </w:pPr>
-      <w:r>
-        <w:t>Ответ на требование о возврате неотработанного аванса</w:t>
+        <w:t>Юрист нужен, когда вторая сторона предъявила требование о возврате аванса, когда предъявлено требование по банковской гарантии или поручительству, когда договор расторгается любой из сторон, когда вам предлагают подписать документ, меняющий природу долга (зачёт, уступку, отступное, новацию, соглашение о переводе долга), и когда идёт спор об объёме и стоимости выполненного.</w:t>
       </w:r>
     </w:p>
     <w:p>
@@ -963,17 +886,18 @@
     </w:p>
     <w:p>
       <w:r>
-        <w:t>Этот лист отвечает на вопрос «что написано в договоре». Вопрос «сколько это стоит в деньгах по месяцам и что просить взамен» требует расчёта и формулировок — они в платном комплекте.</w:t>
+        <w:t/>
         <w:br/>
         <w:br/>
-        <w:t>Комплект «Аванс по договору подряда и неотработанный остаток: условия, расчёт, ответ на требование о возврате».</w:t>
+        <w:t/>
         <w:br/>
-        <w:t>Стоимость: 2 490 ₽</w:t>
+        <w:t/>
         <w:br/>
-        <w:t>Страница комплекта: https://marzhavbetone.ru/products/p8-avans-po-dogovoru-subpodryada.html</w:t>
+        <w:t>
+</w:t>
         <w:br/>
         <w:br/>
-        <w:t>Комплект не заменяет юриста и не гарантирует, что условия изменят или что требование о возврате отзовут: он про расчёт и про порядок разговора, а оценку вашей позиции по спору делает юрист.</w:t>
+        <w:t/>
       </w:r>
     </w:p>
     <w:sectPr>

</xml_diff>